<commit_message>
backtracking + tema minesweeper
</commit_message>
<xml_diff>
--- a/Algoritmi Fundamentali/Teme de Laborator.docx
+++ b/Algoritmi Fundamentali/Teme de Laborator.docx
@@ -558,6 +558,182 @@
           <w:lang w:val="ro-RO"/>
         </w:rPr>
       </w:pPr>
+      <w:r>
+        <w:rPr>
+          <w:rFonts w:ascii="Arial" w:hAnsi="Arial" w:cs="Arial"/>
+          <w:sz w:val="24"/>
+          <w:szCs w:val="24"/>
+          <w:lang w:val="ro-RO"/>
+        </w:rPr>
+        <w:t>În proiectul Minesweeper, realizați 2 din următoarele 3:</w:t>
+      </w:r>
+    </w:p>
+    <w:p>
+      <w:pPr>
+        <w:pStyle w:val="Listparagraf"/>
+        <w:numPr>
+          <w:ilvl w:val="1"/>
+          <w:numId w:val="1"/>
+        </w:numPr>
+        <w:jc w:val="both"/>
+        <w:rPr>
+          <w:rFonts w:ascii="Arial" w:hAnsi="Arial" w:cs="Arial"/>
+          <w:sz w:val="24"/>
+          <w:szCs w:val="24"/>
+          <w:lang w:val="ro-RO"/>
+        </w:rPr>
+      </w:pPr>
+      <w:r>
+        <w:rPr>
+          <w:rFonts w:ascii="Arial" w:hAnsi="Arial" w:cs="Arial"/>
+          <w:b/>
+          <w:bCs/>
+          <w:sz w:val="24"/>
+          <w:szCs w:val="24"/>
+          <w:lang w:val="ro-RO"/>
+        </w:rPr>
+        <w:t>Dificultăți</w:t>
+      </w:r>
+      <w:r>
+        <w:rPr>
+          <w:rFonts w:ascii="Arial" w:hAnsi="Arial" w:cs="Arial"/>
+          <w:sz w:val="24"/>
+          <w:szCs w:val="24"/>
+          <w:lang w:val="ro-RO"/>
+        </w:rPr>
+        <w:t>: deocamdată, 10% din butoane conțin, asta ar fi dificultatea Easy. Faceți așa încât pentru dificultatea Medium, să fie în jur de 14-15%, iar pentru dificultatea Hard 20%. Dificultatea ar trebui să poată fi selectată din interfața jocului, și nu va lua efect decât după apăsarea butonului New Game.</w:t>
+      </w:r>
+    </w:p>
+    <w:p>
+      <w:pPr>
+        <w:pStyle w:val="Listparagraf"/>
+        <w:numPr>
+          <w:ilvl w:val="1"/>
+          <w:numId w:val="1"/>
+        </w:numPr>
+        <w:jc w:val="both"/>
+        <w:rPr>
+          <w:rFonts w:ascii="Arial" w:hAnsi="Arial" w:cs="Arial"/>
+          <w:sz w:val="24"/>
+          <w:szCs w:val="24"/>
+          <w:lang w:val="ro-RO"/>
+        </w:rPr>
+      </w:pPr>
+      <w:r>
+        <w:rPr>
+          <w:rFonts w:ascii="Arial" w:hAnsi="Arial" w:cs="Arial"/>
+          <w:b/>
+          <w:bCs/>
+          <w:sz w:val="24"/>
+          <w:szCs w:val="24"/>
+          <w:lang w:val="ro-RO"/>
+        </w:rPr>
+        <w:t>Imagini</w:t>
+      </w:r>
+      <w:r>
+        <w:rPr>
+          <w:rFonts w:ascii="Arial" w:hAnsi="Arial" w:cs="Arial"/>
+          <w:sz w:val="24"/>
+          <w:szCs w:val="24"/>
+          <w:lang w:val="ro-RO"/>
+        </w:rPr>
+        <w:t xml:space="preserve">: În loc de </w:t>
+      </w:r>
+      <w:r>
+        <w:rPr>
+          <w:rFonts w:ascii="Arial" w:hAnsi="Arial" w:cs="Arial"/>
+          <w:b/>
+          <w:bCs/>
+          <w:color w:val="EE0000"/>
+          <w:sz w:val="24"/>
+          <w:szCs w:val="24"/>
+          <w:lang w:val="ro-RO"/>
+        </w:rPr>
+        <w:t>F</w:t>
+      </w:r>
+      <w:r>
+        <w:rPr>
+          <w:rFonts w:ascii="Arial" w:hAnsi="Arial" w:cs="Arial"/>
+          <w:sz w:val="24"/>
+          <w:szCs w:val="24"/>
+          <w:lang w:val="ro-RO"/>
+        </w:rPr>
+        <w:t xml:space="preserve"> </w:t>
+      </w:r>
+      <w:r>
+        <w:rPr>
+          <w:rFonts w:ascii="Arial" w:hAnsi="Arial" w:cs="Arial"/>
+          <w:sz w:val="24"/>
+          <w:szCs w:val="24"/>
+          <w:lang w:val="ro-RO"/>
+        </w:rPr>
+        <w:t xml:space="preserve">vom afișa o imagine cu un steag, iar în loc de </w:t>
+      </w:r>
+      <w:r>
+        <w:rPr>
+          <w:rFonts w:ascii="Arial" w:hAnsi="Arial" w:cs="Arial"/>
+          <w:b/>
+          <w:bCs/>
+          <w:sz w:val="24"/>
+          <w:szCs w:val="24"/>
+          <w:lang w:val="ro-RO"/>
+        </w:rPr>
+        <w:t>X</w:t>
+      </w:r>
+      <w:r>
+        <w:rPr>
+          <w:rFonts w:ascii="Arial" w:hAnsi="Arial" w:cs="Arial"/>
+          <w:sz w:val="24"/>
+          <w:szCs w:val="24"/>
+          <w:lang w:val="ro-RO"/>
+        </w:rPr>
+        <w:t xml:space="preserve"> o imagine cu o mină.</w:t>
+      </w:r>
+    </w:p>
+    <w:p>
+      <w:pPr>
+        <w:pStyle w:val="Listparagraf"/>
+        <w:numPr>
+          <w:ilvl w:val="1"/>
+          <w:numId w:val="1"/>
+        </w:numPr>
+        <w:jc w:val="both"/>
+        <w:rPr>
+          <w:rFonts w:ascii="Arial" w:hAnsi="Arial" w:cs="Arial"/>
+          <w:sz w:val="24"/>
+          <w:szCs w:val="24"/>
+          <w:lang w:val="ro-RO"/>
+        </w:rPr>
+      </w:pPr>
+      <w:r>
+        <w:rPr>
+          <w:rFonts w:ascii="Arial" w:hAnsi="Arial" w:cs="Arial"/>
+          <w:b/>
+          <w:bCs/>
+          <w:sz w:val="24"/>
+          <w:szCs w:val="24"/>
+          <w:lang w:val="ro-RO"/>
+        </w:rPr>
+        <w:t>Prima mutare validă întotdeauna</w:t>
+      </w:r>
+      <w:r>
+        <w:rPr>
+          <w:rFonts w:ascii="Arial" w:hAnsi="Arial" w:cs="Arial"/>
+          <w:sz w:val="24"/>
+          <w:szCs w:val="24"/>
+          <w:lang w:val="ro-RO"/>
+        </w:rPr>
+        <w:t xml:space="preserve">: Faceți așa încât primul click de după New Game sa fie mereu </w:t>
+      </w:r>
+      <w:r>
+        <w:rPr>
+          <w:rFonts w:ascii="Arial" w:hAnsi="Arial" w:cs="Arial"/>
+          <w:sz w:val="24"/>
+          <w:szCs w:val="24"/>
+          <w:lang w:val="ro-RO"/>
+        </w:rPr>
+        <w:t>pe un buton cu valoarea 0, pentru a avea cel puțin o parcurgere în adâncime activată.</w:t>
+      </w:r>
     </w:p>
     <w:p>
       <w:pPr>
@@ -610,7 +786,7 @@
         <w:bCs/>
       </w:rPr>
     </w:lvl>
-    <w:lvl w:ilvl="1" w:tplc="04090019" w:tentative="1">
+    <w:lvl w:ilvl="1" w:tplc="04090019">
       <w:start w:val="1"/>
       <w:numFmt w:val="lowerLetter"/>
       <w:lvlText w:val="%2."/>

</xml_diff>